<commit_message>
Cân đối lại phân bố đáp án trắc nghiệm (đề 1 và đề 3) + sinh lại bản in
Co-authored-by: arena-agent <297053741+arena-agent@users.noreply.github.com>
</commit_message>
<xml_diff>
--- a/xuat-ban/De-minh-hoa-va-dap-an-GK1.docx
+++ b/xuat-ban/De-minh-hoa-va-dap-an-GK1.docx
@@ -909,7 +909,7 @@
           <w:i w:val="0"/>
           <w:sz w:val="26"/>
         </w:rPr>
-        <w:t xml:space="preserve"> phản ánh rõ nhất bối cảnh lịch sử – văn hoá nào? A. Xã hội phong kiến với bộ máy quan lại chặt chẽ. B. Xã hội nguyên thuỷ – nông nghiệp, với tín ngưỡng đa thần và tư duy hồn nhiên chưa có khoa học. C. Xã hội đô thị hiện đại với pháp luật và toà án. D. Xã hội chiến binh du mục, trọng sức mạnh thể chất.</w:t>
+        <w:t xml:space="preserve"> phản ánh rõ nhất bối cảnh lịch sử – văn hoá nào? A. Xã hội nguyên thuỷ – nông nghiệp, với tín ngưỡng đa thần và tư duy hồn nhiên chưa có khoa học. B. Xã hội phong kiến với bộ máy quan lại chặt chẽ. C. Xã hội đô thị hiện đại với pháp luật và toà án. D. Xã hội chiến binh du mục, trọng sức mạnh thể chất.</w:t>
       </w:r>
     </w:p>
     <w:p>
@@ -950,7 +950,7 @@
           <w:i w:val="0"/>
           <w:sz w:val="26"/>
         </w:rPr>
-        <w:t xml:space="preserve"> có tác dụng chủ yếu gì? A. Nhằm chế giễu, hạ thấp các vị thần. B. Lí giải hiện tượng hạn hán, lụt lội và thể hiện cách người xưa hình dung tự nhiên như một lực lượng vừa ban ơn vừa gây hoạ. C. Nhằm kéo dài câu chuyện cho hấp dẫn. D. Nhằm ca ngợi tài năng của cá chép.</w:t>
+        <w:t xml:space="preserve"> có tác dụng chủ yếu gì? A. Nhằm chế giễu, hạ thấp các vị thần. B. Nhằm kéo dài câu chuyện cho hấp dẫn. C. Nhằm ca ngợi tài năng của cá chép. D. Lí giải hiện tượng hạn hán, lụt lội và thể hiện cách người xưa hình dung tự nhiên như một lực lượng vừa ban ơn vừa gây hoạ.</w:t>
       </w:r>
     </w:p>
     <w:p>
@@ -973,7 +973,7 @@
           <w:i w:val="0"/>
           <w:sz w:val="26"/>
         </w:rPr>
-        <w:t xml:space="preserve"> Việc sử dụng người kể chuyện ngôi thứ ba, ẩn danh có tác dụng gì? A. Khiến câu chuyện trở nên chủ quan, giàu cảm xúc cá nhân. B. Cho phép người kể bao quát cả thiên đình và hạ giới, đồng thời tạo giọng điệu khách quan, trang trọng như đang thuật lại một sự thật nguyên thuỷ. C. Giúp người đọc biết rõ tác giả là ai. D. Làm cho câu chuyện ngắn gọn hơn.</w:t>
+        <w:t xml:space="preserve"> Việc sử dụng người kể chuyện ngôi thứ ba, ẩn danh có tác dụng gì? A. Khiến câu chuyện trở nên chủ quan, giàu cảm xúc cá nhân. B. Giúp người đọc biết rõ tác giả là ai. C. Cho phép người kể bao quát cả thiên đình và hạ giới, đồng thời tạo giọng điệu khách quan, trang trọng như đang thuật lại một sự thật nguyên thuỷ. D. Làm cho câu chuyện ngắn gọn hơn.</w:t>
       </w:r>
     </w:p>
     <w:p>
@@ -1581,7 +1581,7 @@
                 <w:i w:val="0"/>
                 <w:sz w:val="19"/>
               </w:rPr>
-              <w:t>B</w:t>
+              <w:t>A</w:t>
             </w:r>
           </w:p>
         </w:tc>
@@ -1601,7 +1601,7 @@
                 <w:i w:val="0"/>
                 <w:sz w:val="19"/>
               </w:rPr>
-              <w:t>B</w:t>
+              <w:t>D</w:t>
             </w:r>
           </w:p>
         </w:tc>
@@ -1621,7 +1621,7 @@
                 <w:i w:val="0"/>
                 <w:sz w:val="19"/>
               </w:rPr>
-              <w:t>B</w:t>
+              <w:t>C</w:t>
             </w:r>
           </w:p>
         </w:tc>
@@ -2114,7 +2114,7 @@
           <w:i w:val="0"/>
           <w:sz w:val="26"/>
         </w:rPr>
-        <w:t>Câu 6 – B.</w:t>
+        <w:t>Câu 6 – A.</w:t>
       </w:r>
       <w:r>
         <w:rPr>
@@ -2218,7 +2218,7 @@
           <w:i w:val="0"/>
           <w:sz w:val="26"/>
         </w:rPr>
-        <w:t>Câu 7 – B.</w:t>
+        <w:t>Câu 7 – D.</w:t>
       </w:r>
       <w:r>
         <w:rPr>
@@ -2322,7 +2322,7 @@
           <w:i w:val="0"/>
           <w:sz w:val="26"/>
         </w:rPr>
-        <w:t>Câu 8 – B.</w:t>
+        <w:t>Câu 8 – C.</w:t>
       </w:r>
       <w:r>
         <w:rPr>
@@ -2367,7 +2367,7 @@
           <w:i w:val="0"/>
           <w:sz w:val="26"/>
         </w:rPr>
-        <w:t xml:space="preserve">. ▲ Câu B là đáp án </w:t>
+        <w:t xml:space="preserve">. ▲ Đáp án đúng thường là câu </w:t>
       </w:r>
       <w:r>
         <w:rPr>
@@ -10115,7 +10115,7 @@
           <w:i w:val="0"/>
           <w:sz w:val="26"/>
         </w:rPr>
-        <w:t xml:space="preserve"> Theo văn bản, loài người được tạo ra từ A. đất và nước. B. lửa và gió. C. tro và đá. D. bùn và dây thừng.</w:t>
+        <w:t xml:space="preserve"> Theo văn bản, loài người được tạo ra từ A. tro và đá. B. lửa và gió. C. đất và nước. D. bùn và dây thừng.</w:t>
       </w:r>
     </w:p>
     <w:p>
@@ -10225,7 +10225,7 @@
           <w:i w:val="0"/>
           <w:sz w:val="26"/>
         </w:rPr>
-        <w:t xml:space="preserve"> Hình phạt Dớt dành cho Prô-mê-tê là A. trói vào vách núi, mỗi ngày diều hâu mổ gan, ban đêm gan mọc lại. B. biến thành đá. C. đày xuống làm người phàm. D. ném xuống biển.</w:t>
+        <w:t xml:space="preserve"> Hình phạt Dớt dành cho Prô-mê-tê là A. biến thành đá. B. đày xuống làm người phàm. C. ném xuống biển. D. trói vào vách núi, mỗi ngày diều hâu mổ gan, ban đêm gan mọc lại.</w:t>
       </w:r>
     </w:p>
     <w:p>
@@ -10307,7 +10307,7 @@
           <w:i w:val="0"/>
           <w:sz w:val="26"/>
         </w:rPr>
-        <w:t xml:space="preserve"> ban lửa cho loài người? A. Vì lửa nguy hiểm. B. Vì Dớt muốn giữ loài người ở cảnh yếu hèn để dễ cai trị. C. Vì Prô-mê-tê chưa xin phép. D. Vì loài người chưa biết dùng lửa.</w:t>
+        <w:t xml:space="preserve"> ban lửa cho loài người? A. Vì Dớt muốn giữ loài người ở cảnh yếu hèn để dễ cai trị. B. Vì lửa nguy hiểm. C. Vì Prô-mê-tê chưa xin phép. D. Vì loài người chưa biết dùng lửa.</w:t>
       </w:r>
     </w:p>
     <w:p>
@@ -10330,7 +10330,7 @@
           <w:i w:val="0"/>
           <w:sz w:val="26"/>
         </w:rPr>
-        <w:t xml:space="preserve"> Chi tiết "chỉ còn niềm hy vọng nằm lại ở đáy hộp" có ý nghĩa gì? A. Chứng tỏ con người không bao giờ gặp tai hoạ. B. Khẳng định rằng dù tai hoạ tràn khắp nhân gian, </w:t>
+        <w:t xml:space="preserve"> Chi tiết "chỉ còn niềm hy vọng nằm lại ở đáy hộp" có ý nghĩa gì? A. Chứng tỏ con người không bao giờ gặp tai hoạ. B. Giải thích nguồn gốc của chiếc hộp. C. Khẳng định rằng dù tai hoạ tràn khắp nhân gian, </w:t>
       </w:r>
       <w:r>
         <w:rPr>
@@ -10348,7 +10348,7 @@
           <w:i w:val="0"/>
           <w:sz w:val="26"/>
         </w:rPr>
-        <w:t xml:space="preserve"> vẫn là thứ cuối cùng còn lại, giúp con người tiếp tục sống — vừa bi quan vừa lạc quan. C. Giải thích nguồn gốc của chiếc hộp. D. Phê phán tính tò mò của phụ nữ.</w:t>
+        <w:t xml:space="preserve"> vẫn là thứ cuối cùng còn lại, giúp con người tiếp tục sống — vừa bi quan vừa lạc quan. D. Phê phán tính tò mò của phụ nữ.</w:t>
       </w:r>
     </w:p>
     <w:p>
@@ -10820,7 +10820,7 @@
                 <w:i w:val="0"/>
                 <w:sz w:val="19"/>
               </w:rPr>
-              <w:t>A</w:t>
+              <w:t>C</w:t>
             </w:r>
           </w:p>
         </w:tc>
@@ -10900,7 +10900,7 @@
                 <w:i w:val="0"/>
                 <w:sz w:val="19"/>
               </w:rPr>
-              <w:t>A</w:t>
+              <w:t>D</w:t>
             </w:r>
           </w:p>
         </w:tc>
@@ -10940,7 +10940,7 @@
                 <w:i w:val="0"/>
                 <w:sz w:val="19"/>
               </w:rPr>
-              <w:t>B</w:t>
+              <w:t>A</w:t>
             </w:r>
           </w:p>
         </w:tc>
@@ -10960,7 +10960,7 @@
                 <w:i w:val="0"/>
                 <w:sz w:val="19"/>
               </w:rPr>
-              <w:t>B</w:t>
+              <w:t>C</w:t>
             </w:r>
           </w:p>
         </w:tc>
@@ -11005,7 +11005,7 @@
           <w:i w:val="0"/>
           <w:sz w:val="26"/>
         </w:rPr>
-        <w:t>1 – A.</w:t>
+        <w:t>1 – C.</w:t>
       </w:r>
       <w:r>
         <w:rPr>
@@ -11205,7 +11205,7 @@
           <w:i w:val="0"/>
           <w:sz w:val="26"/>
         </w:rPr>
-        <w:t>5 – A.</w:t>
+        <w:t>5 – D.</w:t>
       </w:r>
       <w:r>
         <w:rPr>
@@ -11287,7 +11287,7 @@
           <w:i w:val="0"/>
           <w:sz w:val="26"/>
         </w:rPr>
-        <w:t>7 – B.</w:t>
+        <w:t>7 – A.</w:t>
       </w:r>
       <w:r>
         <w:rPr>
@@ -11319,7 +11319,7 @@
           <w:i w:val="0"/>
           <w:sz w:val="26"/>
         </w:rPr>
-        <w:t>8 – B.</w:t>
+        <w:t>8 – C.</w:t>
       </w:r>
       <w:r>
         <w:rPr>

</xml_diff>